<commit_message>
v13: abolish no-indent-on-first-paragraph house style, apply uniform first-line indent to all body paragraphs (English + Chinese)
</commit_message>
<xml_diff>
--- a/paper/cvgip2025_SGA_chinese_v13.docx
+++ b/paper/cvgip2025_SGA_chinese_v13.docx
@@ -248,6 +248,7 @@
     <w:p/>
     <w:p>
       <w:pPr>
+        <w:ind w:firstLine="360"/>
         <w:jc w:val="both"/>
         <w:rPr>
           <w:rFonts w:ascii="Times New Roman" w:eastAsia="標楷體" w:hAnsi="Times New Roman"/>
@@ -344,6 +345,7 @@
     <w:p/>
     <w:p>
       <w:pPr>
+        <w:ind w:firstLine="360"/>
         <w:jc w:val="both"/>
         <w:rPr>
           <w:rFonts w:ascii="Times New Roman" w:eastAsia="標楷體" w:hAnsi="Times New Roman"/>
@@ -616,6 +618,7 @@
     <w:p/>
     <w:p>
       <w:pPr>
+        <w:ind w:firstLine="360"/>
         <w:jc w:val="both"/>
         <w:rPr>
           <w:rFonts w:ascii="Times New Roman" w:eastAsia="標楷體" w:hAnsi="Times New Roman"/>
@@ -798,6 +801,7 @@
     <w:p/>
     <w:p>
       <w:pPr>
+        <w:ind w:firstLine="360"/>
         <w:jc w:val="both"/>
         <w:rPr>
           <w:rFonts w:ascii="Times New Roman" w:eastAsia="標楷體" w:hAnsi="Times New Roman"/>
@@ -936,6 +940,7 @@
     <w:p/>
     <w:p>
       <w:pPr>
+        <w:ind w:firstLine="360"/>
         <w:jc w:val="both"/>
         <w:rPr>
           <w:rFonts w:ascii="Times New Roman" w:eastAsia="標楷體" w:hAnsi="Times New Roman"/>
@@ -1177,6 +1182,7 @@
     <w:p/>
     <w:p>
       <w:pPr>
+        <w:ind w:firstLine="360"/>
         <w:jc w:val="both"/>
         <w:rPr>
           <w:rFonts w:ascii="Times New Roman" w:eastAsia="標楷體" w:hAnsi="Times New Roman"/>
@@ -1765,6 +1771,7 @@
     <w:p/>
     <w:p>
       <w:pPr>
+        <w:ind w:firstLine="360"/>
         <w:jc w:val="both"/>
         <w:rPr>
           <w:rFonts w:ascii="Times New Roman" w:eastAsia="標楷體" w:hAnsi="Times New Roman"/>
@@ -1810,6 +1817,7 @@
     </w:p>
     <w:p>
       <w:pPr>
+        <w:ind w:firstLine="360"/>
         <w:jc w:val="both"/>
         <w:rPr>
           <w:rFonts w:ascii="Times New Roman" w:eastAsia="標楷體" w:hAnsi="Times New Roman"/>
@@ -2616,6 +2624,7 @@
     </w:p>
     <w:p>
       <w:pPr>
+        <w:ind w:firstLine="360"/>
         <w:jc w:val="both"/>
         <w:rPr>
           <w:rFonts w:ascii="Times New Roman" w:eastAsia="標楷體" w:hAnsi="Times New Roman"/>
@@ -2974,6 +2983,7 @@
     </w:p>
     <w:p>
       <w:pPr>
+        <w:ind w:firstLine="360"/>
         <w:jc w:val="both"/>
         <w:rPr>
           <w:rFonts w:ascii="Times New Roman" w:eastAsia="標楷體" w:hAnsi="Times New Roman"/>
@@ -3471,6 +3481,7 @@
     <w:p/>
     <w:p>
       <w:pPr>
+        <w:ind w:firstLine="360"/>
         <w:jc w:val="both"/>
         <w:rPr>
           <w:rFonts w:ascii="Times New Roman" w:eastAsia="標楷體" w:hAnsi="Times New Roman"/>
@@ -3732,6 +3743,7 @@
     <w:p/>
     <w:p>
       <w:pPr>
+        <w:ind w:firstLine="360"/>
         <w:jc w:val="both"/>
         <w:rPr>
           <w:rFonts w:ascii="Times New Roman" w:eastAsia="標楷體" w:hAnsi="Times New Roman"/>
@@ -3780,6 +3792,7 @@
     <w:p/>
     <w:p>
       <w:pPr>
+        <w:ind w:firstLine="360"/>
         <w:jc w:val="both"/>
         <w:rPr>
           <w:rFonts w:ascii="Times New Roman" w:eastAsia="標楷體" w:hAnsi="Times New Roman"/>
@@ -4249,6 +4262,7 @@
     <w:p/>
     <w:p>
       <w:pPr>
+        <w:ind w:firstLine="360"/>
         <w:jc w:val="both"/>
         <w:rPr>
           <w:rFonts w:ascii="Times New Roman" w:eastAsia="標楷體" w:hAnsi="Times New Roman"/>
@@ -4435,6 +4449,7 @@
     <w:p/>
     <w:p>
       <w:pPr>
+        <w:ind w:firstLine="360"/>
         <w:jc w:val="both"/>
         <w:rPr>
           <w:rFonts w:ascii="Times New Roman" w:eastAsia="標楷體" w:hAnsi="Times New Roman"/>
@@ -4498,6 +4513,7 @@
     </w:p>
     <w:p>
       <w:pPr>
+        <w:ind w:firstLine="360"/>
         <w:jc w:val="both"/>
         <w:rPr>
           <w:rFonts w:ascii="Times New Roman" w:eastAsia="標楷體" w:hAnsi="Times New Roman"/>
@@ -4797,6 +4813,7 @@
     </w:p>
     <w:p>
       <w:pPr>
+        <w:ind w:firstLine="360"/>
         <w:jc w:val="both"/>
         <w:rPr>
           <w:rFonts w:ascii="Times New Roman" w:eastAsia="標楷體" w:hAnsi="Times New Roman"/>
@@ -4877,6 +4894,7 @@
     <w:p/>
     <w:p>
       <w:pPr>
+        <w:ind w:firstLine="360"/>
         <w:jc w:val="both"/>
         <w:rPr>
           <w:rFonts w:ascii="Times New Roman" w:eastAsia="標楷體" w:hAnsi="Times New Roman"/>
@@ -5089,6 +5107,7 @@
     <w:p/>
     <w:p>
       <w:pPr>
+        <w:ind w:firstLine="360"/>
         <w:jc w:val="both"/>
         <w:rPr>
           <w:rFonts w:ascii="Times New Roman" w:eastAsia="標楷體" w:hAnsi="Times New Roman"/>
@@ -6231,6 +6250,7 @@
     <w:p/>
     <w:p>
       <w:pPr>
+        <w:ind w:firstLine="360"/>
         <w:jc w:val="both"/>
         <w:rPr>
           <w:rFonts w:ascii="Times New Roman" w:eastAsia="標楷體" w:hAnsi="Times New Roman"/>
@@ -6771,6 +6791,7 @@
     <w:p/>
     <w:p>
       <w:pPr>
+        <w:ind w:firstLine="360"/>
         <w:jc w:val="both"/>
         <w:rPr>
           <w:rFonts w:ascii="Times New Roman" w:eastAsia="標楷體" w:hAnsi="Times New Roman"/>
@@ -8248,6 +8269,7 @@
     <w:p/>
     <w:p>
       <w:pPr>
+        <w:ind w:firstLine="360"/>
         <w:jc w:val="both"/>
         <w:rPr>
           <w:rFonts w:ascii="Times New Roman" w:eastAsia="標楷體" w:hAnsi="Times New Roman"/>
@@ -8569,6 +8591,7 @@
     <w:p/>
     <w:p>
       <w:pPr>
+        <w:ind w:firstLine="360"/>
         <w:jc w:val="both"/>
         <w:rPr>
           <w:rFonts w:ascii="Times New Roman" w:eastAsia="標楷體" w:hAnsi="Times New Roman"/>

</xml_diff>